<commit_message>
feat: PREDICT logo across the app, forms and e-mails; trust Render proxy
Vector and raster logo assets generated from one geometry
(make_logo_assets.py): header mark and favicon on all workspaces, full
logo on the welcome page, logo in invitation e-mails and on the Word
form covers. ProxyFix behind Render so external links (invitations)
use https and the custom domain.

Co-Authored-By: Claude Fable 5.1 <noreply@anthropic.com>
</commit_message>
<xml_diff>
--- a/PREDICT_expert_prior_form_EN.docx
+++ b/PREDICT_expert_prior_form_EN.docx
@@ -2,6 +2,46 @@
 <file path=word/document.xml><?xml version="1.0" encoding="utf-8"?>
 <w:document xmlns:wpc="http://schemas.microsoft.com/office/word/2010/wordprocessingCanvas" xmlns:mo="http://schemas.microsoft.com/office/mac/office/2008/main" xmlns:mc="http://schemas.openxmlformats.org/markup-compatibility/2006" xmlns:mv="urn:schemas-microsoft-com:mac:vml" xmlns:o="urn:schemas-microsoft-com:office:office" xmlns:r="http://schemas.openxmlformats.org/officeDocument/2006/relationships" xmlns:m="http://schemas.openxmlformats.org/officeDocument/2006/math" xmlns:v="urn:schemas-microsoft-com:vml" xmlns:wp14="http://schemas.microsoft.com/office/word/2010/wordprocessingDrawing" xmlns:wp="http://schemas.openxmlformats.org/drawingml/2006/wordprocessingDrawing" xmlns:w10="urn:schemas-microsoft-com:office:word" xmlns:w="http://schemas.openxmlformats.org/wordprocessingml/2006/main" xmlns:w14="http://schemas.microsoft.com/office/word/2010/wordml" xmlns:wpg="http://schemas.microsoft.com/office/word/2010/wordprocessingGroup" xmlns:wpi="http://schemas.microsoft.com/office/word/2010/wordprocessingInk" xmlns:wne="http://schemas.microsoft.com/office/word/2006/wordml" xmlns:wps="http://schemas.microsoft.com/office/word/2010/wordprocessingShape" mc:Ignorable="w14 wp14">
   <w:body>
+    <w:p>
+      <w:pPr>
+        <w:spacing w:after="80"/>
+        <w:jc w:val="center"/>
+      </w:pPr>
+      <w:r>
+        <w:drawing>
+          <wp:inline xmlns:a="http://schemas.openxmlformats.org/drawingml/2006/main" xmlns:pic="http://schemas.openxmlformats.org/drawingml/2006/picture">
+            <wp:extent cx="1512000" cy="1874880"/>
+            <wp:docPr id="1" name="Picture 1"/>
+            <wp:cNvGraphicFramePr>
+              <a:graphicFrameLocks noChangeAspect="1"/>
+            </wp:cNvGraphicFramePr>
+            <a:graphic>
+              <a:graphicData uri="http://schemas.openxmlformats.org/drawingml/2006/picture">
+                <pic:pic>
+                  <pic:nvPicPr>
+                    <pic:cNvPr id="0" name="predict-logo.png"/>
+                    <pic:cNvPicPr/>
+                  </pic:nvPicPr>
+                  <pic:blipFill>
+                    <a:blip r:embed="rId11"/>
+                    <a:stretch>
+                      <a:fillRect/>
+                    </a:stretch>
+                  </pic:blipFill>
+                  <pic:spPr>
+                    <a:xfrm>
+                      <a:off x="0" y="0"/>
+                      <a:ext cx="1512000" cy="1874880"/>
+                    </a:xfrm>
+                    <a:prstGeom prst="rect"/>
+                  </pic:spPr>
+                </pic:pic>
+              </a:graphicData>
+            </a:graphic>
+          </wp:inline>
+        </w:drawing>
+      </w:r>
+    </w:p>
     <w:p>
       <w:pPr>
         <w:spacing w:after="40"/>

</xml_diff>

<commit_message>
Add the Semmelweis University logo alongside the PREDICT logo
- meghívólevél fejléce: PREDICT balra, Semmelweis jobbra, vékony vonal alatta
- világos intézményi lábléc minden oldalon (a sötét fejlécbe nem illik)
- főoldal márkasora: Semmelweis-logó jobbra
- Word-űrlap címlapja: kétcellás fejléc a két logóval

Co-Authored-By: Claude Fable 5.1 <noreply@anthropic.com>
</commit_message>
<xml_diff>
--- a/PREDICT_expert_prior_form_EN.docx
+++ b/PREDICT_expert_prior_form_EN.docx
@@ -2,45 +2,110 @@
 <file path=word/document.xml><?xml version="1.0" encoding="utf-8"?>
 <w:document xmlns:wpc="http://schemas.microsoft.com/office/word/2010/wordprocessingCanvas" xmlns:mo="http://schemas.microsoft.com/office/mac/office/2008/main" xmlns:mc="http://schemas.openxmlformats.org/markup-compatibility/2006" xmlns:mv="urn:schemas-microsoft-com:mac:vml" xmlns:o="urn:schemas-microsoft-com:office:office" xmlns:r="http://schemas.openxmlformats.org/officeDocument/2006/relationships" xmlns:m="http://schemas.openxmlformats.org/officeDocument/2006/math" xmlns:v="urn:schemas-microsoft-com:vml" xmlns:wp14="http://schemas.microsoft.com/office/word/2010/wordprocessingDrawing" xmlns:wp="http://schemas.openxmlformats.org/drawingml/2006/wordprocessingDrawing" xmlns:w10="urn:schemas-microsoft-com:office:word" xmlns:w="http://schemas.openxmlformats.org/wordprocessingml/2006/main" xmlns:w14="http://schemas.microsoft.com/office/word/2010/wordml" xmlns:wpg="http://schemas.microsoft.com/office/word/2010/wordprocessingGroup" xmlns:wpi="http://schemas.microsoft.com/office/word/2010/wordprocessingInk" xmlns:wne="http://schemas.microsoft.com/office/word/2006/wordml" xmlns:wps="http://schemas.microsoft.com/office/word/2010/wordprocessingShape" mc:Ignorable="w14 wp14">
   <w:body>
+    <w:tbl>
+      <w:tblPr>
+        <w:tblW w:type="auto" w:w="0"/>
+        <w:tblLayout w:type="fixed"/>
+        <w:tblLook w:firstColumn="1" w:firstRow="1" w:lastColumn="0" w:lastRow="0" w:noHBand="0" w:noVBand="1" w:val="04A0"/>
+      </w:tblPr>
+      <w:tblGrid>
+        <w:gridCol w:w="4933"/>
+        <w:gridCol w:w="4933"/>
+      </w:tblGrid>
+      <w:tr>
+        <w:tc>
+          <w:tcPr>
+            <w:tcW w:type="dxa" w:w="4932"/>
+            <w:vAlign w:val="bottom"/>
+          </w:tcPr>
+          <w:p>
+            <w:r>
+              <w:drawing>
+                <wp:inline xmlns:a="http://schemas.openxmlformats.org/drawingml/2006/main" xmlns:pic="http://schemas.openxmlformats.org/drawingml/2006/picture">
+                  <wp:extent cx="936000" cy="1160640"/>
+                  <wp:docPr id="1" name="Picture 1"/>
+                  <wp:cNvGraphicFramePr>
+                    <a:graphicFrameLocks noChangeAspect="1"/>
+                  </wp:cNvGraphicFramePr>
+                  <a:graphic>
+                    <a:graphicData uri="http://schemas.openxmlformats.org/drawingml/2006/picture">
+                      <pic:pic>
+                        <pic:nvPicPr>
+                          <pic:cNvPr id="0" name="predict-logo.png"/>
+                          <pic:cNvPicPr/>
+                        </pic:nvPicPr>
+                        <pic:blipFill>
+                          <a:blip r:embed="rId11"/>
+                          <a:stretch>
+                            <a:fillRect/>
+                          </a:stretch>
+                        </pic:blipFill>
+                        <pic:spPr>
+                          <a:xfrm>
+                            <a:off x="0" y="0"/>
+                            <a:ext cx="936000" cy="1160640"/>
+                          </a:xfrm>
+                          <a:prstGeom prst="rect"/>
+                        </pic:spPr>
+                      </pic:pic>
+                    </a:graphicData>
+                  </a:graphic>
+                </wp:inline>
+              </w:drawing>
+            </w:r>
+          </w:p>
+        </w:tc>
+        <w:tc>
+          <w:tcPr>
+            <w:tcW w:type="dxa" w:w="4932"/>
+            <w:vAlign w:val="bottom"/>
+          </w:tcPr>
+          <w:p>
+            <w:pPr>
+              <w:jc w:val="right"/>
+            </w:pPr>
+            <w:r>
+              <w:drawing>
+                <wp:inline xmlns:a="http://schemas.openxmlformats.org/drawingml/2006/main" xmlns:pic="http://schemas.openxmlformats.org/drawingml/2006/picture">
+                  <wp:extent cx="2015999" cy="587294"/>
+                  <wp:docPr id="2" name="Picture 2"/>
+                  <wp:cNvGraphicFramePr>
+                    <a:graphicFrameLocks noChangeAspect="1"/>
+                  </wp:cNvGraphicFramePr>
+                  <a:graphic>
+                    <a:graphicData uri="http://schemas.openxmlformats.org/drawingml/2006/picture">
+                      <pic:pic>
+                        <pic:nvPicPr>
+                          <pic:cNvPr id="0" name="semmelweis-logo.png"/>
+                          <pic:cNvPicPr/>
+                        </pic:nvPicPr>
+                        <pic:blipFill>
+                          <a:blip r:embed="rId12"/>
+                          <a:stretch>
+                            <a:fillRect/>
+                          </a:stretch>
+                        </pic:blipFill>
+                        <pic:spPr>
+                          <a:xfrm>
+                            <a:off x="0" y="0"/>
+                            <a:ext cx="2015999" cy="587294"/>
+                          </a:xfrm>
+                          <a:prstGeom prst="rect"/>
+                        </pic:spPr>
+                      </pic:pic>
+                    </a:graphicData>
+                  </a:graphic>
+                </wp:inline>
+              </w:drawing>
+            </w:r>
+          </w:p>
+        </w:tc>
+      </w:tr>
+    </w:tbl>
     <w:p>
       <w:pPr>
-        <w:spacing w:after="80"/>
-        <w:jc w:val="center"/>
+        <w:spacing w:after="40"/>
       </w:pPr>
-      <w:r>
-        <w:drawing>
-          <wp:inline xmlns:a="http://schemas.openxmlformats.org/drawingml/2006/main" xmlns:pic="http://schemas.openxmlformats.org/drawingml/2006/picture">
-            <wp:extent cx="1512000" cy="1874880"/>
-            <wp:docPr id="1" name="Picture 1"/>
-            <wp:cNvGraphicFramePr>
-              <a:graphicFrameLocks noChangeAspect="1"/>
-            </wp:cNvGraphicFramePr>
-            <a:graphic>
-              <a:graphicData uri="http://schemas.openxmlformats.org/drawingml/2006/picture">
-                <pic:pic>
-                  <pic:nvPicPr>
-                    <pic:cNvPr id="0" name="predict-logo.png"/>
-                    <pic:cNvPicPr/>
-                  </pic:nvPicPr>
-                  <pic:blipFill>
-                    <a:blip r:embed="rId11"/>
-                    <a:stretch>
-                      <a:fillRect/>
-                    </a:stretch>
-                  </pic:blipFill>
-                  <pic:spPr>
-                    <a:xfrm>
-                      <a:off x="0" y="0"/>
-                      <a:ext cx="1512000" cy="1874880"/>
-                    </a:xfrm>
-                    <a:prstGeom prst="rect"/>
-                  </pic:spPr>
-                </pic:pic>
-              </a:graphicData>
-            </a:graphic>
-          </wp:inline>
-        </w:drawing>
-      </w:r>
     </w:p>
     <w:p>
       <w:pPr>

</xml_diff>

<commit_message>
Hundred-patients numbers follow the direction answer
- „nincs érdemi különbség”: egyetlen közös szám (K) a saját határaival, az A/B
  mezők rejtve és figyelmen kívül hagyva
- „nem tudom megítélni”: a számblokk rejtve, számot nem kérünk
- „a közepes a legjobb”: A, közepes, B; irányos válasz: A, B
- ellenőrzés módonként; export siker_K oszlopokkal; a logit-szkript a közös
  számot használja a „nincs különbség” szintjéhez és az 5. ábrán
- szimulátor, Word-űrlapok, protokoll ennek megfelelően

Co-Authored-By: Claude Fable 5.1 <noreply@anthropic.com>
</commit_message>
<xml_diff>
--- a/PREDICT_expert_prior_form_EN.docx
+++ b/PREDICT_expert_prior_form_EN.docx
@@ -1818,7 +1818,45 @@
                 <w:i w:val="0"/>
                 <w:sz w:val="21"/>
               </w:rPr>
-              <w:t>☐ I cannot estimate the size (I only mark the direction)</w:t>
+              <w:t>If there is no meaningful difference: of 100 such patients, how many are successful with either variant? The most likely number and the limits are needed here too.</w:t>
+            </w:r>
+          </w:p>
+          <w:p>
+            <w:pPr>
+              <w:spacing w:after="20"/>
+            </w:pPr>
+            <w:r>
+              <w:rPr>
+                <w:b w:val="0"/>
+                <w:i w:val="0"/>
+                <w:sz w:val="21"/>
+              </w:rPr>
+              <w:t>For both variants:   at least ______   most likely ______   at most ______   successful in a hundred</w:t>
+            </w:r>
+          </w:p>
+          <w:p>
+            <w:pPr>
+              <w:spacing w:after="20"/>
+            </w:pPr>
+            <w:r>
+              <w:rPr>
+                <w:b w:val="0"/>
+                <w:i w:val="0"/>
+                <w:sz w:val="21"/>
+              </w:rPr>
+            </w:r>
+          </w:p>
+          <w:p>
+            <w:pPr>
+              <w:spacing w:after="20"/>
+            </w:pPr>
+            <w:r>
+              <w:rPr>
+                <w:b w:val="0"/>
+                <w:i w:val="0"/>
+                <w:sz w:val="21"/>
+              </w:rPr>
+              <w:t>☐ I cannot estimate the size (I only mark the direction)     When you choose “cannot judge”, no numbers are asked.</w:t>
             </w:r>
           </w:p>
         </w:tc>
@@ -2219,7 +2257,45 @@
                 <w:i w:val="0"/>
                 <w:sz w:val="21"/>
               </w:rPr>
-              <w:t>☐ I cannot estimate the size (I only mark the direction)</w:t>
+              <w:t>If there is no meaningful difference: of 100 such patients, how many are successful with either variant? The most likely number and the limits are needed here too.</w:t>
+            </w:r>
+          </w:p>
+          <w:p>
+            <w:pPr>
+              <w:spacing w:after="20"/>
+            </w:pPr>
+            <w:r>
+              <w:rPr>
+                <w:b w:val="0"/>
+                <w:i w:val="0"/>
+                <w:sz w:val="21"/>
+              </w:rPr>
+              <w:t>For both variants:   at least ______   most likely ______   at most ______   successful in a hundred</w:t>
+            </w:r>
+          </w:p>
+          <w:p>
+            <w:pPr>
+              <w:spacing w:after="20"/>
+            </w:pPr>
+            <w:r>
+              <w:rPr>
+                <w:b w:val="0"/>
+                <w:i w:val="0"/>
+                <w:sz w:val="21"/>
+              </w:rPr>
+            </w:r>
+          </w:p>
+          <w:p>
+            <w:pPr>
+              <w:spacing w:after="20"/>
+            </w:pPr>
+            <w:r>
+              <w:rPr>
+                <w:b w:val="0"/>
+                <w:i w:val="0"/>
+                <w:sz w:val="21"/>
+              </w:rPr>
+              <w:t>☐ I cannot estimate the size (I only mark the direction)     When you choose “cannot judge”, no numbers are asked.</w:t>
             </w:r>
           </w:p>
         </w:tc>
@@ -2599,7 +2675,45 @@
                 <w:i w:val="0"/>
                 <w:sz w:val="21"/>
               </w:rPr>
-              <w:t>☐ I cannot estimate the size (I only mark the direction)</w:t>
+              <w:t>If there is no meaningful difference: of 100 such patients, how many are successful with either variant? The most likely number and the limits are needed here too.</w:t>
+            </w:r>
+          </w:p>
+          <w:p>
+            <w:pPr>
+              <w:spacing w:after="20"/>
+            </w:pPr>
+            <w:r>
+              <w:rPr>
+                <w:b w:val="0"/>
+                <w:i w:val="0"/>
+                <w:sz w:val="21"/>
+              </w:rPr>
+              <w:t>For both variants:   at least ______   most likely ______   at most ______   successful in a hundred</w:t>
+            </w:r>
+          </w:p>
+          <w:p>
+            <w:pPr>
+              <w:spacing w:after="20"/>
+            </w:pPr>
+            <w:r>
+              <w:rPr>
+                <w:b w:val="0"/>
+                <w:i w:val="0"/>
+                <w:sz w:val="21"/>
+              </w:rPr>
+            </w:r>
+          </w:p>
+          <w:p>
+            <w:pPr>
+              <w:spacing w:after="20"/>
+            </w:pPr>
+            <w:r>
+              <w:rPr>
+                <w:b w:val="0"/>
+                <w:i w:val="0"/>
+                <w:sz w:val="21"/>
+              </w:rPr>
+              <w:t>☐ I cannot estimate the size (I only mark the direction)     When you choose “cannot judge”, no numbers are asked.</w:t>
             </w:r>
           </w:p>
         </w:tc>
@@ -2974,7 +3088,45 @@
                 <w:i w:val="0"/>
                 <w:sz w:val="21"/>
               </w:rPr>
-              <w:t>☐ I cannot estimate the size (I only mark the direction)</w:t>
+              <w:t>If there is no meaningful difference: of 100 such patients, how many are successful with either variant? The most likely number and the limits are needed here too.</w:t>
+            </w:r>
+          </w:p>
+          <w:p>
+            <w:pPr>
+              <w:spacing w:after="20"/>
+            </w:pPr>
+            <w:r>
+              <w:rPr>
+                <w:b w:val="0"/>
+                <w:i w:val="0"/>
+                <w:sz w:val="21"/>
+              </w:rPr>
+              <w:t>For both variants:   at least ______   most likely ______   at most ______   successful in a hundred</w:t>
+            </w:r>
+          </w:p>
+          <w:p>
+            <w:pPr>
+              <w:spacing w:after="20"/>
+            </w:pPr>
+            <w:r>
+              <w:rPr>
+                <w:b w:val="0"/>
+                <w:i w:val="0"/>
+                <w:sz w:val="21"/>
+              </w:rPr>
+            </w:r>
+          </w:p>
+          <w:p>
+            <w:pPr>
+              <w:spacing w:after="20"/>
+            </w:pPr>
+            <w:r>
+              <w:rPr>
+                <w:b w:val="0"/>
+                <w:i w:val="0"/>
+                <w:sz w:val="21"/>
+              </w:rPr>
+              <w:t>☐ I cannot estimate the size (I only mark the direction)     When you choose “cannot judge”, no numbers are asked.</w:t>
             </w:r>
           </w:p>
         </w:tc>
@@ -3354,7 +3506,45 @@
                 <w:i w:val="0"/>
                 <w:sz w:val="21"/>
               </w:rPr>
-              <w:t>☐ I cannot estimate the size (I only mark the direction)</w:t>
+              <w:t>If there is no meaningful difference: of 100 such patients, how many are successful with either variant? The most likely number and the limits are needed here too.</w:t>
+            </w:r>
+          </w:p>
+          <w:p>
+            <w:pPr>
+              <w:spacing w:after="20"/>
+            </w:pPr>
+            <w:r>
+              <w:rPr>
+                <w:b w:val="0"/>
+                <w:i w:val="0"/>
+                <w:sz w:val="21"/>
+              </w:rPr>
+              <w:t>For both variants:   at least ______   most likely ______   at most ______   successful in a hundred</w:t>
+            </w:r>
+          </w:p>
+          <w:p>
+            <w:pPr>
+              <w:spacing w:after="20"/>
+            </w:pPr>
+            <w:r>
+              <w:rPr>
+                <w:b w:val="0"/>
+                <w:i w:val="0"/>
+                <w:sz w:val="21"/>
+              </w:rPr>
+            </w:r>
+          </w:p>
+          <w:p>
+            <w:pPr>
+              <w:spacing w:after="20"/>
+            </w:pPr>
+            <w:r>
+              <w:rPr>
+                <w:b w:val="0"/>
+                <w:i w:val="0"/>
+                <w:sz w:val="21"/>
+              </w:rPr>
+              <w:t>☐ I cannot estimate the size (I only mark the direction)     When you choose “cannot judge”, no numbers are asked.</w:t>
             </w:r>
           </w:p>
         </w:tc>
@@ -3768,7 +3958,45 @@
                 <w:i w:val="0"/>
                 <w:sz w:val="21"/>
               </w:rPr>
-              <w:t>☐ I cannot estimate the size (I only mark the direction)</w:t>
+              <w:t>If there is no meaningful difference: of 100 such patients, how many are successful with either variant? The most likely number and the limits are needed here too.</w:t>
+            </w:r>
+          </w:p>
+          <w:p>
+            <w:pPr>
+              <w:spacing w:after="20"/>
+            </w:pPr>
+            <w:r>
+              <w:rPr>
+                <w:b w:val="0"/>
+                <w:i w:val="0"/>
+                <w:sz w:val="21"/>
+              </w:rPr>
+              <w:t>For both variants:   at least ______   most likely ______   at most ______   successful in a hundred</w:t>
+            </w:r>
+          </w:p>
+          <w:p>
+            <w:pPr>
+              <w:spacing w:after="20"/>
+            </w:pPr>
+            <w:r>
+              <w:rPr>
+                <w:b w:val="0"/>
+                <w:i w:val="0"/>
+                <w:sz w:val="21"/>
+              </w:rPr>
+            </w:r>
+          </w:p>
+          <w:p>
+            <w:pPr>
+              <w:spacing w:after="20"/>
+            </w:pPr>
+            <w:r>
+              <w:rPr>
+                <w:b w:val="0"/>
+                <w:i w:val="0"/>
+                <w:sz w:val="21"/>
+              </w:rPr>
+              <w:t>☐ I cannot estimate the size (I only mark the direction)     When you choose “cannot judge”, no numbers are asked.</w:t>
             </w:r>
           </w:p>
         </w:tc>
@@ -4202,7 +4430,45 @@
                 <w:i w:val="0"/>
                 <w:sz w:val="21"/>
               </w:rPr>
-              <w:t>☐ I cannot estimate the size (I only mark the direction)</w:t>
+              <w:t>If there is no meaningful difference: of 100 such patients, how many are successful with either variant? The most likely number and the limits are needed here too.</w:t>
+            </w:r>
+          </w:p>
+          <w:p>
+            <w:pPr>
+              <w:spacing w:after="20"/>
+            </w:pPr>
+            <w:r>
+              <w:rPr>
+                <w:b w:val="0"/>
+                <w:i w:val="0"/>
+                <w:sz w:val="21"/>
+              </w:rPr>
+              <w:t>For both variants:   at least ______   most likely ______   at most ______   successful in a hundred</w:t>
+            </w:r>
+          </w:p>
+          <w:p>
+            <w:pPr>
+              <w:spacing w:after="20"/>
+            </w:pPr>
+            <w:r>
+              <w:rPr>
+                <w:b w:val="0"/>
+                <w:i w:val="0"/>
+                <w:sz w:val="21"/>
+              </w:rPr>
+            </w:r>
+          </w:p>
+          <w:p>
+            <w:pPr>
+              <w:spacing w:after="20"/>
+            </w:pPr>
+            <w:r>
+              <w:rPr>
+                <w:b w:val="0"/>
+                <w:i w:val="0"/>
+                <w:sz w:val="21"/>
+              </w:rPr>
+              <w:t>☐ I cannot estimate the size (I only mark the direction)     When you choose “cannot judge”, no numbers are asked.</w:t>
             </w:r>
           </w:p>
         </w:tc>
@@ -4590,7 +4856,45 @@
                 <w:i w:val="0"/>
                 <w:sz w:val="21"/>
               </w:rPr>
-              <w:t>☐ I cannot estimate the size (I only mark the direction)</w:t>
+              <w:t>If there is no meaningful difference: of 100 such patients, how many are successful with either variant? The most likely number and the limits are needed here too.</w:t>
+            </w:r>
+          </w:p>
+          <w:p>
+            <w:pPr>
+              <w:spacing w:after="20"/>
+            </w:pPr>
+            <w:r>
+              <w:rPr>
+                <w:b w:val="0"/>
+                <w:i w:val="0"/>
+                <w:sz w:val="21"/>
+              </w:rPr>
+              <w:t>For both variants:   at least ______   most likely ______   at most ______   successful in a hundred</w:t>
+            </w:r>
+          </w:p>
+          <w:p>
+            <w:pPr>
+              <w:spacing w:after="20"/>
+            </w:pPr>
+            <w:r>
+              <w:rPr>
+                <w:b w:val="0"/>
+                <w:i w:val="0"/>
+                <w:sz w:val="21"/>
+              </w:rPr>
+            </w:r>
+          </w:p>
+          <w:p>
+            <w:pPr>
+              <w:spacing w:after="20"/>
+            </w:pPr>
+            <w:r>
+              <w:rPr>
+                <w:b w:val="0"/>
+                <w:i w:val="0"/>
+                <w:sz w:val="21"/>
+              </w:rPr>
+              <w:t>☐ I cannot estimate the size (I only mark the direction)     When you choose “cannot judge”, no numbers are asked.</w:t>
             </w:r>
           </w:p>
         </w:tc>
@@ -4983,7 +5287,45 @@
                 <w:i w:val="0"/>
                 <w:sz w:val="21"/>
               </w:rPr>
-              <w:t>☐ I cannot estimate the size (I only mark the direction)</w:t>
+              <w:t>If there is no meaningful difference: of 100 such patients, how many are successful with either variant? The most likely number and the limits are needed here too.</w:t>
+            </w:r>
+          </w:p>
+          <w:p>
+            <w:pPr>
+              <w:spacing w:after="20"/>
+            </w:pPr>
+            <w:r>
+              <w:rPr>
+                <w:b w:val="0"/>
+                <w:i w:val="0"/>
+                <w:sz w:val="21"/>
+              </w:rPr>
+              <w:t>For both variants:   at least ______   most likely ______   at most ______   successful in a hundred</w:t>
+            </w:r>
+          </w:p>
+          <w:p>
+            <w:pPr>
+              <w:spacing w:after="20"/>
+            </w:pPr>
+            <w:r>
+              <w:rPr>
+                <w:b w:val="0"/>
+                <w:i w:val="0"/>
+                <w:sz w:val="21"/>
+              </w:rPr>
+            </w:r>
+          </w:p>
+          <w:p>
+            <w:pPr>
+              <w:spacing w:after="20"/>
+            </w:pPr>
+            <w:r>
+              <w:rPr>
+                <w:b w:val="0"/>
+                <w:i w:val="0"/>
+                <w:sz w:val="21"/>
+              </w:rPr>
+              <w:t>☐ I cannot estimate the size (I only mark the direction)     When you choose “cannot judge”, no numbers are asked.</w:t>
             </w:r>
           </w:p>
         </w:tc>
@@ -5466,7 +5808,45 @@
                 <w:i w:val="0"/>
                 <w:sz w:val="21"/>
               </w:rPr>
-              <w:t>☐ I cannot estimate the size (I only mark the direction)</w:t>
+              <w:t>If there is no meaningful difference: of 100 such patients, how many are successful with either variant? The most likely number and the limits are needed here too.</w:t>
+            </w:r>
+          </w:p>
+          <w:p>
+            <w:pPr>
+              <w:spacing w:after="20"/>
+            </w:pPr>
+            <w:r>
+              <w:rPr>
+                <w:b w:val="0"/>
+                <w:i w:val="0"/>
+                <w:sz w:val="21"/>
+              </w:rPr>
+              <w:t>For both variants:   at least ______   most likely ______   at most ______   successful in a hundred</w:t>
+            </w:r>
+          </w:p>
+          <w:p>
+            <w:pPr>
+              <w:spacing w:after="20"/>
+            </w:pPr>
+            <w:r>
+              <w:rPr>
+                <w:b w:val="0"/>
+                <w:i w:val="0"/>
+                <w:sz w:val="21"/>
+              </w:rPr>
+            </w:r>
+          </w:p>
+          <w:p>
+            <w:pPr>
+              <w:spacing w:after="20"/>
+            </w:pPr>
+            <w:r>
+              <w:rPr>
+                <w:b w:val="0"/>
+                <w:i w:val="0"/>
+                <w:sz w:val="21"/>
+              </w:rPr>
+              <w:t>☐ I cannot estimate the size (I only mark the direction)     When you choose “cannot judge”, no numbers are asked.</w:t>
             </w:r>
           </w:p>
         </w:tc>
@@ -5859,7 +6239,45 @@
                 <w:i w:val="0"/>
                 <w:sz w:val="21"/>
               </w:rPr>
-              <w:t>☐ I cannot estimate the size (I only mark the direction)</w:t>
+              <w:t>If there is no meaningful difference: of 100 such patients, how many are successful with either variant? The most likely number and the limits are needed here too.</w:t>
+            </w:r>
+          </w:p>
+          <w:p>
+            <w:pPr>
+              <w:spacing w:after="20"/>
+            </w:pPr>
+            <w:r>
+              <w:rPr>
+                <w:b w:val="0"/>
+                <w:i w:val="0"/>
+                <w:sz w:val="21"/>
+              </w:rPr>
+              <w:t>For both variants:   at least ______   most likely ______   at most ______   successful in a hundred</w:t>
+            </w:r>
+          </w:p>
+          <w:p>
+            <w:pPr>
+              <w:spacing w:after="20"/>
+            </w:pPr>
+            <w:r>
+              <w:rPr>
+                <w:b w:val="0"/>
+                <w:i w:val="0"/>
+                <w:sz w:val="21"/>
+              </w:rPr>
+            </w:r>
+          </w:p>
+          <w:p>
+            <w:pPr>
+              <w:spacing w:after="20"/>
+            </w:pPr>
+            <w:r>
+              <w:rPr>
+                <w:b w:val="0"/>
+                <w:i w:val="0"/>
+                <w:sz w:val="21"/>
+              </w:rPr>
+              <w:t>☐ I cannot estimate the size (I only mark the direction)     When you choose “cannot judge”, no numbers are asked.</w:t>
             </w:r>
           </w:p>
         </w:tc>
@@ -6247,7 +6665,45 @@
                 <w:i w:val="0"/>
                 <w:sz w:val="21"/>
               </w:rPr>
-              <w:t>☐ I cannot estimate the size (I only mark the direction)</w:t>
+              <w:t>If there is no meaningful difference: of 100 such patients, how many are successful with either variant? The most likely number and the limits are needed here too.</w:t>
+            </w:r>
+          </w:p>
+          <w:p>
+            <w:pPr>
+              <w:spacing w:after="20"/>
+            </w:pPr>
+            <w:r>
+              <w:rPr>
+                <w:b w:val="0"/>
+                <w:i w:val="0"/>
+                <w:sz w:val="21"/>
+              </w:rPr>
+              <w:t>For both variants:   at least ______   most likely ______   at most ______   successful in a hundred</w:t>
+            </w:r>
+          </w:p>
+          <w:p>
+            <w:pPr>
+              <w:spacing w:after="20"/>
+            </w:pPr>
+            <w:r>
+              <w:rPr>
+                <w:b w:val="0"/>
+                <w:i w:val="0"/>
+                <w:sz w:val="21"/>
+              </w:rPr>
+            </w:r>
+          </w:p>
+          <w:p>
+            <w:pPr>
+              <w:spacing w:after="20"/>
+            </w:pPr>
+            <w:r>
+              <w:rPr>
+                <w:b w:val="0"/>
+                <w:i w:val="0"/>
+                <w:sz w:val="21"/>
+              </w:rPr>
+              <w:t>☐ I cannot estimate the size (I only mark the direction)     When you choose “cannot judge”, no numbers are asked.</w:t>
             </w:r>
           </w:p>
         </w:tc>
@@ -6640,7 +7096,45 @@
                 <w:i w:val="0"/>
                 <w:sz w:val="21"/>
               </w:rPr>
-              <w:t>☐ I cannot estimate the size (I only mark the direction)</w:t>
+              <w:t>If there is no meaningful difference: of 100 such patients, how many are successful with either variant? The most likely number and the limits are needed here too.</w:t>
+            </w:r>
+          </w:p>
+          <w:p>
+            <w:pPr>
+              <w:spacing w:after="20"/>
+            </w:pPr>
+            <w:r>
+              <w:rPr>
+                <w:b w:val="0"/>
+                <w:i w:val="0"/>
+                <w:sz w:val="21"/>
+              </w:rPr>
+              <w:t>For both variants:   at least ______   most likely ______   at most ______   successful in a hundred</w:t>
+            </w:r>
+          </w:p>
+          <w:p>
+            <w:pPr>
+              <w:spacing w:after="20"/>
+            </w:pPr>
+            <w:r>
+              <w:rPr>
+                <w:b w:val="0"/>
+                <w:i w:val="0"/>
+                <w:sz w:val="21"/>
+              </w:rPr>
+            </w:r>
+          </w:p>
+          <w:p>
+            <w:pPr>
+              <w:spacing w:after="20"/>
+            </w:pPr>
+            <w:r>
+              <w:rPr>
+                <w:b w:val="0"/>
+                <w:i w:val="0"/>
+                <w:sz w:val="21"/>
+              </w:rPr>
+              <w:t>☐ I cannot estimate the size (I only mark the direction)     When you choose “cannot judge”, no numbers are asked.</w:t>
             </w:r>
           </w:p>
         </w:tc>
@@ -7041,7 +7535,45 @@
                 <w:i w:val="0"/>
                 <w:sz w:val="21"/>
               </w:rPr>
-              <w:t>☐ I cannot estimate the size (I only mark the direction)</w:t>
+              <w:t>If there is no meaningful difference: of 100 such patients, how many are successful with either variant? The most likely number and the limits are needed here too.</w:t>
+            </w:r>
+          </w:p>
+          <w:p>
+            <w:pPr>
+              <w:spacing w:after="20"/>
+            </w:pPr>
+            <w:r>
+              <w:rPr>
+                <w:b w:val="0"/>
+                <w:i w:val="0"/>
+                <w:sz w:val="21"/>
+              </w:rPr>
+              <w:t>For both variants:   at least ______   most likely ______   at most ______   successful in a hundred</w:t>
+            </w:r>
+          </w:p>
+          <w:p>
+            <w:pPr>
+              <w:spacing w:after="20"/>
+            </w:pPr>
+            <w:r>
+              <w:rPr>
+                <w:b w:val="0"/>
+                <w:i w:val="0"/>
+                <w:sz w:val="21"/>
+              </w:rPr>
+            </w:r>
+          </w:p>
+          <w:p>
+            <w:pPr>
+              <w:spacing w:after="20"/>
+            </w:pPr>
+            <w:r>
+              <w:rPr>
+                <w:b w:val="0"/>
+                <w:i w:val="0"/>
+                <w:sz w:val="21"/>
+              </w:rPr>
+              <w:t>☐ I cannot estimate the size (I only mark the direction)     When you choose “cannot judge”, no numbers are asked.</w:t>
             </w:r>
           </w:p>
         </w:tc>
@@ -7434,7 +7966,45 @@
                 <w:i w:val="0"/>
                 <w:sz w:val="21"/>
               </w:rPr>
-              <w:t>☐ I cannot estimate the size (I only mark the direction)</w:t>
+              <w:t>If there is no meaningful difference: of 100 such patients, how many are successful with either variant? The most likely number and the limits are needed here too.</w:t>
+            </w:r>
+          </w:p>
+          <w:p>
+            <w:pPr>
+              <w:spacing w:after="20"/>
+            </w:pPr>
+            <w:r>
+              <w:rPr>
+                <w:b w:val="0"/>
+                <w:i w:val="0"/>
+                <w:sz w:val="21"/>
+              </w:rPr>
+              <w:t>For both variants:   at least ______   most likely ______   at most ______   successful in a hundred</w:t>
+            </w:r>
+          </w:p>
+          <w:p>
+            <w:pPr>
+              <w:spacing w:after="20"/>
+            </w:pPr>
+            <w:r>
+              <w:rPr>
+                <w:b w:val="0"/>
+                <w:i w:val="0"/>
+                <w:sz w:val="21"/>
+              </w:rPr>
+            </w:r>
+          </w:p>
+          <w:p>
+            <w:pPr>
+              <w:spacing w:after="20"/>
+            </w:pPr>
+            <w:r>
+              <w:rPr>
+                <w:b w:val="0"/>
+                <w:i w:val="0"/>
+                <w:sz w:val="21"/>
+              </w:rPr>
+              <w:t>☐ I cannot estimate the size (I only mark the direction)     When you choose “cannot judge”, no numbers are asked.</w:t>
             </w:r>
           </w:p>
         </w:tc>
@@ -7822,7 +8392,45 @@
                 <w:i w:val="0"/>
                 <w:sz w:val="21"/>
               </w:rPr>
-              <w:t>☐ I cannot estimate the size (I only mark the direction)</w:t>
+              <w:t>If there is no meaningful difference: of 100 such patients, how many are successful with either variant? The most likely number and the limits are needed here too.</w:t>
+            </w:r>
+          </w:p>
+          <w:p>
+            <w:pPr>
+              <w:spacing w:after="20"/>
+            </w:pPr>
+            <w:r>
+              <w:rPr>
+                <w:b w:val="0"/>
+                <w:i w:val="0"/>
+                <w:sz w:val="21"/>
+              </w:rPr>
+              <w:t>For both variants:   at least ______   most likely ______   at most ______   successful in a hundred</w:t>
+            </w:r>
+          </w:p>
+          <w:p>
+            <w:pPr>
+              <w:spacing w:after="20"/>
+            </w:pPr>
+            <w:r>
+              <w:rPr>
+                <w:b w:val="0"/>
+                <w:i w:val="0"/>
+                <w:sz w:val="21"/>
+              </w:rPr>
+            </w:r>
+          </w:p>
+          <w:p>
+            <w:pPr>
+              <w:spacing w:after="20"/>
+            </w:pPr>
+            <w:r>
+              <w:rPr>
+                <w:b w:val="0"/>
+                <w:i w:val="0"/>
+                <w:sz w:val="21"/>
+              </w:rPr>
+              <w:t>☐ I cannot estimate the size (I only mark the direction)     When you choose “cannot judge”, no numbers are asked.</w:t>
             </w:r>
           </w:p>
         </w:tc>

</xml_diff>

<commit_message>
Questionnaire fixes from the PI's own run-through
- A10 (Angle-osztály): nincs „a közepes a legjobb” válasz
- a nem alkalmazható „száz beteg” sorok szürkék és inaktívak (a rejtés a
  rács-elrendezés miatt nem érvényesült); „nem tudom” esetén az egész blokk
- tuberculum B pólus: „feszes ínnyel nem fedett, plicaszerű, mozgékony”
- rangsor állcsontonként: a felső és az alsó állcsont három-három legfontosabb
  adottsága (rang_felso_1..3, rang_also_1..3; a régi rang_1..5 olvasható marad)
- Word-űrlapok, protokoll, R-regiszter ennek megfelelően

Co-Authored-By: Claude Fable 5.1 <noreply@anthropic.com>
</commit_message>
<xml_diff>
--- a/PREDICT_expert_prior_form_EN.docx
+++ b/PREDICT_expert_prior_form_EN.docx
@@ -6938,7 +6938,7 @@
                 <w:i w:val="0"/>
                 <w:sz w:val="21"/>
               </w:rPr>
-              <w:t>☐ Variant B is worse:  uncovered, fold-like, mobile</w:t>
+              <w:t>☐ Variant B is worse:  not covered by firm gingiva, fold-like, mobile tuberculum</w:t>
             </w:r>
           </w:p>
           <w:p>
@@ -7071,7 +7071,7 @@
                 <w:i w:val="0"/>
                 <w:sz w:val="21"/>
               </w:rPr>
-              <w:t>Variant B (uncovered, fold-like, mobile):   at least ______   most likely ______   at most ______   successful in a hundred</w:t>
+              <w:t>Variant B (not covered by firm gingiva, fold-like, mobile tuberculum):   at least ______   most likely ______   at most ______   successful in a hundred</w:t>
             </w:r>
           </w:p>
           <w:p>
@@ -7365,19 +7365,6 @@
                 <w:sz w:val="21"/>
               </w:rPr>
               <w:t>☐ Variant B is worse:  Angle Class II or III, deviating relation</w:t>
-            </w:r>
-          </w:p>
-          <w:p>
-            <w:pPr>
-              <w:spacing w:after="20"/>
-            </w:pPr>
-            <w:r>
-              <w:rPr>
-                <w:b w:val="0"/>
-                <w:i w:val="0"/>
-                <w:sz w:val="21"/>
-              </w:rPr>
-              <w:t>☐ Neither: the middle is best, both extremes are worse</w:t>
             </w:r>
           </w:p>
           <w:p>
@@ -8577,7 +8564,7 @@
                 <w:i w:val="0"/>
                 <w:sz w:val="20"/>
               </w:rPr>
-              <w:t>The five most important</w:t>
+              <w:t>Upper jaw</w:t>
             </w:r>
           </w:p>
         </w:tc>
@@ -8596,7 +8583,7 @@
                 <w:i w:val="0"/>
                 <w:sz w:val="21"/>
               </w:rPr>
-              <w:t>Which five features matter most for the success of the denture? Start with the most important.</w:t>
+              <w:t>Upper jaw: which three features matter most? Start with the most important.</w:t>
             </w:r>
           </w:p>
           <w:p>
@@ -8621,7 +8608,7 @@
                 <w:i w:val="0"/>
                 <w:sz w:val="21"/>
               </w:rPr>
-              <w:t>1. ________   2. ________   3. ________   4. ________   5. ________</w:t>
+              <w:t>1. ________   2. ________   3. ________</w:t>
             </w:r>
           </w:p>
           <w:p>
@@ -8646,7 +8633,98 @@
                 <w:i w:val="0"/>
                 <w:sz w:val="21"/>
               </w:rPr>
-              <w:t>F1 = Height of the upper ridge   F2 = Undercut areas of the upper jaw   F3 = Height of the palate   F4 = Shape of the upper ridge arch   F5 = Flabby ridge in the upper jaw   F6 = Position of the upper and lower ridge crests relative to each other   F7 = Torus palatinus   F8 = What opposes the upper denture (antagonist)   A1 = Shape and height of the lower ridge (Kaán classification)   A3 = The buccinator pouch   A4 = Torus mandibularis   A5 = The lingual pouch during swallowing   TUB = The retromolar pad (tuberculum alveolare mandibulae)   A10 = Sagittal relation of the jaws   A11 = The floor of the mouth   A12 = Genial tubercles (spinae mentales)</w:t>
+              <w:t>F1 = Height of the upper ridge   F2 = Undercut areas of the upper jaw   F3 = Height of the palate   F4 = Shape of the upper ridge arch   F5 = Flabby ridge in the upper jaw   F6 = Position of the upper and lower ridge crests relative to each other   F7 = Torus palatinus   F8 = What opposes the upper denture (antagonist)</w:t>
+            </w:r>
+          </w:p>
+        </w:tc>
+      </w:tr>
+      <w:tr>
+        <w:tc>
+          <w:tcPr>
+            <w:tcW w:type="dxa" w:w="2835"/>
+            <w:shd w:val="clear" w:color="auto" w:fill="F2F2F0"/>
+          </w:tcPr>
+          <w:p>
+            <w:pPr>
+              <w:spacing w:after="20"/>
+            </w:pPr>
+            <w:r/>
+            <w:r>
+              <w:rPr>
+                <w:b/>
+                <w:i w:val="0"/>
+                <w:sz w:val="20"/>
+              </w:rPr>
+              <w:t>Lower jaw</w:t>
+            </w:r>
+          </w:p>
+        </w:tc>
+        <w:tc>
+          <w:tcPr>
+            <w:tcW w:type="dxa" w:w="7030"/>
+          </w:tcPr>
+          <w:p>
+            <w:pPr>
+              <w:spacing w:after="20"/>
+            </w:pPr>
+            <w:r/>
+            <w:r>
+              <w:rPr>
+                <w:b w:val="0"/>
+                <w:i w:val="0"/>
+                <w:sz w:val="21"/>
+              </w:rPr>
+              <w:t>Lower jaw: which three features matter most? Start with the most important.</w:t>
+            </w:r>
+          </w:p>
+          <w:p>
+            <w:pPr>
+              <w:spacing w:after="20"/>
+            </w:pPr>
+            <w:r>
+              <w:rPr>
+                <w:b w:val="0"/>
+                <w:i w:val="0"/>
+                <w:sz w:val="21"/>
+              </w:rPr>
+            </w:r>
+          </w:p>
+          <w:p>
+            <w:pPr>
+              <w:spacing w:after="20"/>
+            </w:pPr>
+            <w:r>
+              <w:rPr>
+                <w:b w:val="0"/>
+                <w:i w:val="0"/>
+                <w:sz w:val="21"/>
+              </w:rPr>
+              <w:t>1. ________   2. ________   3. ________</w:t>
+            </w:r>
+          </w:p>
+          <w:p>
+            <w:pPr>
+              <w:spacing w:after="20"/>
+            </w:pPr>
+            <w:r>
+              <w:rPr>
+                <w:b w:val="0"/>
+                <w:i w:val="0"/>
+                <w:sz w:val="21"/>
+              </w:rPr>
+            </w:r>
+          </w:p>
+          <w:p>
+            <w:pPr>
+              <w:spacing w:after="20"/>
+            </w:pPr>
+            <w:r>
+              <w:rPr>
+                <w:b w:val="0"/>
+                <w:i w:val="0"/>
+                <w:sz w:val="21"/>
+              </w:rPr>
+              <w:t>A1 = Shape and height of the lower ridge (Kaán classification)   A3 = The buccinator pouch   A4 = Torus mandibularis   A5 = The lingual pouch during swallowing   TUB = The retromolar pad (tuberculum alveolare mandibulae)   A10 = Sagittal relation of the jaws   A11 = The floor of the mouth   A12 = Genial tubercles (spinae mentales)</w:t>
             </w:r>
           </w:p>
         </w:tc>

</xml_diff>